<commit_message>
Data Loader setup done
</commit_message>
<xml_diff>
--- a/Note1.docx
+++ b/Note1.docx
@@ -9,21 +9,12 @@
           <w:szCs w:val="48"/>
         </w:rPr>
       </w:pPr>
-      <w:proofErr w:type="spellStart"/>
       <w:r>
         <w:rPr>
           <w:sz w:val="48"/>
           <w:szCs w:val="48"/>
         </w:rPr>
-        <w:t>KnowledgeBase</w:t>
-      </w:r>
-      <w:proofErr w:type="spellEnd"/>
-      <w:r>
-        <w:rPr>
-          <w:sz w:val="48"/>
-          <w:szCs w:val="48"/>
-        </w:rPr>
-        <w:t xml:space="preserve"> AI — Local RAG Assistant</w:t>
+        <w:t>KnowledgeBase AI — Local RAG Assistant</w:t>
       </w:r>
     </w:p>
     <w:p>
@@ -129,15 +120,7 @@
     </w:p>
     <w:p>
       <w:r>
-        <w:t xml:space="preserve">        </w:t>
-      </w:r>
-      <w:proofErr w:type="spellStart"/>
-      <w:r>
-        <w:t>KnowledgeBase</w:t>
-      </w:r>
-      <w:proofErr w:type="spellEnd"/>
-      <w:r>
-        <w:t xml:space="preserve"> AI</w:t>
+        <w:t xml:space="preserve">        KnowledgeBase AI</w:t>
       </w:r>
     </w:p>
     <w:p>
@@ -197,10 +180,7 @@
     </w:p>
     <w:p>
       <w:r>
-        <w:t>Sources:</w:t>
-      </w:r>
-      <w:r>
-        <w:t xml:space="preserve"> </w:t>
+        <w:t xml:space="preserve">Sources: </w:t>
       </w:r>
       <w:r>
         <w:rPr>
@@ -344,11 +324,9 @@
             <w:hideMark/>
           </w:tcPr>
           <w:p>
-            <w:proofErr w:type="spellStart"/>
             <w:r>
               <w:t>FastAPI</w:t>
             </w:r>
-            <w:proofErr w:type="spellEnd"/>
           </w:p>
         </w:tc>
       </w:tr>
@@ -404,11 +382,9 @@
             <w:hideMark/>
           </w:tcPr>
           <w:p>
-            <w:proofErr w:type="spellStart"/>
             <w:r>
               <w:t>ChromaDB</w:t>
             </w:r>
-            <w:proofErr w:type="spellEnd"/>
           </w:p>
         </w:tc>
       </w:tr>
@@ -493,11 +469,9 @@
             <w:hideMark/>
           </w:tcPr>
           <w:p>
-            <w:proofErr w:type="spellStart"/>
             <w:r>
               <w:t>Streamlit</w:t>
             </w:r>
-            <w:proofErr w:type="spellEnd"/>
           </w:p>
         </w:tc>
       </w:tr>
@@ -553,11 +527,9 @@
             <w:hideMark/>
           </w:tcPr>
           <w:p>
-            <w:proofErr w:type="spellStart"/>
             <w:r>
               <w:t>Pytest</w:t>
             </w:r>
-            <w:proofErr w:type="spellEnd"/>
           </w:p>
         </w:tc>
       </w:tr>
@@ -622,6 +594,9 @@
     </w:tbl>
     <w:p>
       <w:r>
+        <w:rPr>
+          <w:noProof/>
+        </w:rPr>
         <w:lastRenderedPageBreak/>
         <w:drawing>
           <wp:inline distT="0" distB="0" distL="0" distR="0" wp14:anchorId="66284FA5" wp14:editId="5AA0990B">
@@ -663,6 +638,9 @@
         <w:br/>
       </w:r>
       <w:r>
+        <w:rPr>
+          <w:noProof/>
+        </w:rPr>
         <w:drawing>
           <wp:inline distT="0" distB="0" distL="0" distR="0" wp14:anchorId="11A4623A" wp14:editId="7C48D943">
             <wp:extent cx="5731510" cy="3345180"/>
@@ -701,6 +679,328 @@
       </w:r>
       <w:r>
         <w:br/>
+      </w:r>
+    </w:p>
+    <w:p>
+      <w:r>
+        <w:t>`````````````````````</w:t>
+      </w:r>
+      <w:r>
+        <w:br/>
+        <w:t>CROMADB</w:t>
+      </w:r>
+      <w:r>
+        <w:br/>
+      </w:r>
+    </w:p>
+    <w:p>
+      <w:r>
+        <w:t>Suppose we have:</w:t>
+      </w:r>
+    </w:p>
+    <w:p>
+      <w:r>
+        <w:t>Chunk 0:</w:t>
+      </w:r>
+      <w:r>
+        <w:br/>
+      </w:r>
+      <w:r>
+        <w:t>Docker is a platform used to package applications...</w:t>
+      </w:r>
+    </w:p>
+    <w:p/>
+    <w:p>
+      <w:r>
+        <w:lastRenderedPageBreak/>
+        <w:t>Chunk 1:</w:t>
+      </w:r>
+      <w:r>
+        <w:br/>
+      </w:r>
+      <w:r>
+        <w:t>Docker images are templates used to create containers.</w:t>
+      </w:r>
+    </w:p>
+    <w:p/>
+    <w:p>
+      <w:r>
+        <w:t>Chunk 2:</w:t>
+      </w:r>
+      <w:r>
+        <w:br/>
+      </w:r>
+      <w:r>
+        <w:t>Docker Compose can define multiple containers...</w:t>
+      </w:r>
+    </w:p>
+    <w:p/>
+    <w:p>
+      <w:r>
+        <w:drawing>
+          <wp:inline distT="0" distB="0" distL="0" distR="0" wp14:anchorId="78573FB3" wp14:editId="28065E54">
+            <wp:extent cx="5731510" cy="3516630"/>
+            <wp:effectExtent l="0" t="0" r="2540" b="7620"/>
+            <wp:docPr id="960352015" name="Picture 1"/>
+            <wp:cNvGraphicFramePr>
+              <a:graphicFrameLocks xmlns:a="http://schemas.openxmlformats.org/drawingml/2006/main" noChangeAspect="1"/>
+            </wp:cNvGraphicFramePr>
+            <a:graphic xmlns:a="http://schemas.openxmlformats.org/drawingml/2006/main">
+              <a:graphicData uri="http://schemas.openxmlformats.org/drawingml/2006/picture">
+                <pic:pic xmlns:pic="http://schemas.openxmlformats.org/drawingml/2006/picture">
+                  <pic:nvPicPr>
+                    <pic:cNvPr id="960352015" name=""/>
+                    <pic:cNvPicPr/>
+                  </pic:nvPicPr>
+                  <pic:blipFill>
+                    <a:blip r:embed="rId6"/>
+                    <a:stretch>
+                      <a:fillRect/>
+                    </a:stretch>
+                  </pic:blipFill>
+                  <pic:spPr>
+                    <a:xfrm>
+                      <a:off x="0" y="0"/>
+                      <a:ext cx="5731510" cy="3516630"/>
+                    </a:xfrm>
+                    <a:prstGeom prst="rect">
+                      <a:avLst/>
+                    </a:prstGeom>
+                  </pic:spPr>
+                </pic:pic>
+              </a:graphicData>
+            </a:graphic>
+          </wp:inline>
+        </w:drawing>
+      </w:r>
+      <w:r>
+        <w:br/>
+      </w:r>
+      <w:r>
+        <w:t>Then a user asks:</w:t>
+      </w:r>
+      <w:r>
+        <w:t xml:space="preserve"> </w:t>
+      </w:r>
+      <w:r>
+        <w:t>What is Docker?</w:t>
+      </w:r>
+      <w:r>
+        <w:br/>
+      </w:r>
+      <w:r>
+        <w:t xml:space="preserve">ChromaDB searches the vectors and returns the chunks whose </w:t>
+      </w:r>
+      <w:r>
+        <w:rPr>
+          <w:b/>
+          <w:bCs/>
+        </w:rPr>
+        <w:t>meaning is closest</w:t>
+      </w:r>
+      <w:r>
+        <w:t xml:space="preserve"> to the question.</w:t>
+      </w:r>
+    </w:p>
+    <w:p>
+      <w:r>
+        <w:lastRenderedPageBreak/>
+        <w:drawing>
+          <wp:inline distT="0" distB="0" distL="0" distR="0" wp14:anchorId="3668C339" wp14:editId="77252868">
+            <wp:extent cx="5731510" cy="1795145"/>
+            <wp:effectExtent l="0" t="0" r="2540" b="0"/>
+            <wp:docPr id="1866677173" name="Picture 1"/>
+            <wp:cNvGraphicFramePr>
+              <a:graphicFrameLocks xmlns:a="http://schemas.openxmlformats.org/drawingml/2006/main" noChangeAspect="1"/>
+            </wp:cNvGraphicFramePr>
+            <a:graphic xmlns:a="http://schemas.openxmlformats.org/drawingml/2006/main">
+              <a:graphicData uri="http://schemas.openxmlformats.org/drawingml/2006/picture">
+                <pic:pic xmlns:pic="http://schemas.openxmlformats.org/drawingml/2006/picture">
+                  <pic:nvPicPr>
+                    <pic:cNvPr id="1866677173" name=""/>
+                    <pic:cNvPicPr/>
+                  </pic:nvPicPr>
+                  <pic:blipFill>
+                    <a:blip r:embed="rId7"/>
+                    <a:stretch>
+                      <a:fillRect/>
+                    </a:stretch>
+                  </pic:blipFill>
+                  <pic:spPr>
+                    <a:xfrm>
+                      <a:off x="0" y="0"/>
+                      <a:ext cx="5731510" cy="1795145"/>
+                    </a:xfrm>
+                    <a:prstGeom prst="rect">
+                      <a:avLst/>
+                    </a:prstGeom>
+                  </pic:spPr>
+                </pic:pic>
+              </a:graphicData>
+            </a:graphic>
+          </wp:inline>
+        </w:drawing>
+      </w:r>
+      <w:r>
+        <w:br/>
+      </w:r>
+      <w:r>
+        <w:drawing>
+          <wp:inline distT="0" distB="0" distL="0" distR="0" wp14:anchorId="2C283C80" wp14:editId="50B50737">
+            <wp:extent cx="5731510" cy="1224915"/>
+            <wp:effectExtent l="0" t="0" r="2540" b="0"/>
+            <wp:docPr id="614475743" name="Picture 1"/>
+            <wp:cNvGraphicFramePr>
+              <a:graphicFrameLocks xmlns:a="http://schemas.openxmlformats.org/drawingml/2006/main" noChangeAspect="1"/>
+            </wp:cNvGraphicFramePr>
+            <a:graphic xmlns:a="http://schemas.openxmlformats.org/drawingml/2006/main">
+              <a:graphicData uri="http://schemas.openxmlformats.org/drawingml/2006/picture">
+                <pic:pic xmlns:pic="http://schemas.openxmlformats.org/drawingml/2006/picture">
+                  <pic:nvPicPr>
+                    <pic:cNvPr id="614475743" name=""/>
+                    <pic:cNvPicPr/>
+                  </pic:nvPicPr>
+                  <pic:blipFill>
+                    <a:blip r:embed="rId8"/>
+                    <a:stretch>
+                      <a:fillRect/>
+                    </a:stretch>
+                  </pic:blipFill>
+                  <pic:spPr>
+                    <a:xfrm>
+                      <a:off x="0" y="0"/>
+                      <a:ext cx="5731510" cy="1224915"/>
+                    </a:xfrm>
+                    <a:prstGeom prst="rect">
+                      <a:avLst/>
+                    </a:prstGeom>
+                  </pic:spPr>
+                </pic:pic>
+              </a:graphicData>
+            </a:graphic>
+          </wp:inline>
+        </w:drawing>
+      </w:r>
+      <w:r>
+        <w:br/>
+      </w:r>
+      <w:r>
+        <w:lastRenderedPageBreak/>
+        <w:drawing>
+          <wp:inline distT="0" distB="0" distL="0" distR="0" wp14:anchorId="37DC50BD" wp14:editId="736C9D22">
+            <wp:extent cx="5731510" cy="2627630"/>
+            <wp:effectExtent l="0" t="0" r="2540" b="1270"/>
+            <wp:docPr id="1737466362" name="Picture 1"/>
+            <wp:cNvGraphicFramePr>
+              <a:graphicFrameLocks xmlns:a="http://schemas.openxmlformats.org/drawingml/2006/main" noChangeAspect="1"/>
+            </wp:cNvGraphicFramePr>
+            <a:graphic xmlns:a="http://schemas.openxmlformats.org/drawingml/2006/main">
+              <a:graphicData uri="http://schemas.openxmlformats.org/drawingml/2006/picture">
+                <pic:pic xmlns:pic="http://schemas.openxmlformats.org/drawingml/2006/picture">
+                  <pic:nvPicPr>
+                    <pic:cNvPr id="1737466362" name=""/>
+                    <pic:cNvPicPr/>
+                  </pic:nvPicPr>
+                  <pic:blipFill>
+                    <a:blip r:embed="rId9"/>
+                    <a:stretch>
+                      <a:fillRect/>
+                    </a:stretch>
+                  </pic:blipFill>
+                  <pic:spPr>
+                    <a:xfrm>
+                      <a:off x="0" y="0"/>
+                      <a:ext cx="5731510" cy="2627630"/>
+                    </a:xfrm>
+                    <a:prstGeom prst="rect">
+                      <a:avLst/>
+                    </a:prstGeom>
+                  </pic:spPr>
+                </pic:pic>
+              </a:graphicData>
+            </a:graphic>
+          </wp:inline>
+        </w:drawing>
+      </w:r>
+      <w:r>
+        <w:br/>
+      </w:r>
+      <w:r>
+        <w:drawing>
+          <wp:inline distT="0" distB="0" distL="0" distR="0" wp14:anchorId="46408FFD" wp14:editId="793AB1FB">
+            <wp:extent cx="5731510" cy="3158490"/>
+            <wp:effectExtent l="0" t="0" r="2540" b="3810"/>
+            <wp:docPr id="146764427" name="Picture 1"/>
+            <wp:cNvGraphicFramePr>
+              <a:graphicFrameLocks xmlns:a="http://schemas.openxmlformats.org/drawingml/2006/main" noChangeAspect="1"/>
+            </wp:cNvGraphicFramePr>
+            <a:graphic xmlns:a="http://schemas.openxmlformats.org/drawingml/2006/main">
+              <a:graphicData uri="http://schemas.openxmlformats.org/drawingml/2006/picture">
+                <pic:pic xmlns:pic="http://schemas.openxmlformats.org/drawingml/2006/picture">
+                  <pic:nvPicPr>
+                    <pic:cNvPr id="146764427" name=""/>
+                    <pic:cNvPicPr/>
+                  </pic:nvPicPr>
+                  <pic:blipFill>
+                    <a:blip r:embed="rId10"/>
+                    <a:stretch>
+                      <a:fillRect/>
+                    </a:stretch>
+                  </pic:blipFill>
+                  <pic:spPr>
+                    <a:xfrm>
+                      <a:off x="0" y="0"/>
+                      <a:ext cx="5731510" cy="3158490"/>
+                    </a:xfrm>
+                    <a:prstGeom prst="rect">
+                      <a:avLst/>
+                    </a:prstGeom>
+                  </pic:spPr>
+                </pic:pic>
+              </a:graphicData>
+            </a:graphic>
+          </wp:inline>
+        </w:drawing>
+      </w:r>
+    </w:p>
+    <w:p>
+      <w:r>
+        <w:lastRenderedPageBreak/>
+        <w:drawing>
+          <wp:inline distT="0" distB="0" distL="0" distR="0" wp14:anchorId="4C9FB0EE" wp14:editId="04E11CA7">
+            <wp:extent cx="5731510" cy="3326765"/>
+            <wp:effectExtent l="0" t="0" r="2540" b="6985"/>
+            <wp:docPr id="2110333947" name="Picture 1"/>
+            <wp:cNvGraphicFramePr>
+              <a:graphicFrameLocks xmlns:a="http://schemas.openxmlformats.org/drawingml/2006/main" noChangeAspect="1"/>
+            </wp:cNvGraphicFramePr>
+            <a:graphic xmlns:a="http://schemas.openxmlformats.org/drawingml/2006/main">
+              <a:graphicData uri="http://schemas.openxmlformats.org/drawingml/2006/picture">
+                <pic:pic xmlns:pic="http://schemas.openxmlformats.org/drawingml/2006/picture">
+                  <pic:nvPicPr>
+                    <pic:cNvPr id="2110333947" name=""/>
+                    <pic:cNvPicPr/>
+                  </pic:nvPicPr>
+                  <pic:blipFill>
+                    <a:blip r:embed="rId11"/>
+                    <a:stretch>
+                      <a:fillRect/>
+                    </a:stretch>
+                  </pic:blipFill>
+                  <pic:spPr>
+                    <a:xfrm>
+                      <a:off x="0" y="0"/>
+                      <a:ext cx="5731510" cy="3326765"/>
+                    </a:xfrm>
+                    <a:prstGeom prst="rect">
+                      <a:avLst/>
+                    </a:prstGeom>
+                  </pic:spPr>
+                </pic:pic>
+              </a:graphicData>
+            </a:graphic>
+          </wp:inline>
+        </w:drawing>
       </w:r>
     </w:p>
     <w:sectPr>
@@ -1629,6 +1929,17 @@
       <w:spacing w:val="5"/>
     </w:rPr>
   </w:style>
+  <w:style w:type="paragraph" w:styleId="NormalWeb">
+    <w:name w:val="Normal (Web)"/>
+    <w:basedOn w:val="Normal"/>
+    <w:uiPriority w:val="99"/>
+    <w:semiHidden/>
+    <w:unhideWhenUsed/>
+    <w:rsid w:val="00030BF9"/>
+    <w:rPr>
+      <w:rFonts w:ascii="Times New Roman" w:hAnsi="Times New Roman" w:cs="Times New Roman"/>
+    </w:rPr>
+  </w:style>
 </w:styles>
 </file>
 

</xml_diff>